<commit_message>
Datawarehouse + Power Bi + ML
</commit_message>
<xml_diff>
--- a/docs/Modelisation_DataWarehouse.docx
+++ b/docs/Modelisation_DataWarehouse.docx
@@ -48,10 +48,10 @@
           <w:lang w:val="fr-FR"/>
         </w:rPr>
         <w:drawing>
-          <wp:inline distT="0" distB="0" distL="0" distR="0" wp14:anchorId="0176F5C2" wp14:editId="0B4B074D">
-            <wp:extent cx="5486400" cy="4029710"/>
-            <wp:effectExtent l="0" t="0" r="0" b="8890"/>
-            <wp:docPr id="928520232" name="Picture 1"/>
+          <wp:inline distT="0" distB="0" distL="0" distR="0" wp14:anchorId="5C79DF90" wp14:editId="0E1BD525">
+            <wp:extent cx="5486400" cy="4145280"/>
+            <wp:effectExtent l="0" t="0" r="0" b="7620"/>
+            <wp:docPr id="1609769141" name="Picture 1"/>
             <wp:cNvGraphicFramePr>
               <a:graphicFrameLocks xmlns:a="http://schemas.openxmlformats.org/drawingml/2006/main" noChangeAspect="1"/>
             </wp:cNvGraphicFramePr>
@@ -59,7 +59,7 @@
               <a:graphicData uri="http://schemas.openxmlformats.org/drawingml/2006/picture">
                 <pic:pic xmlns:pic="http://schemas.openxmlformats.org/drawingml/2006/picture">
                   <pic:nvPicPr>
-                    <pic:cNvPr id="928520232" name="Picture 928520232"/>
+                    <pic:cNvPr id="1609769141" name="Picture 1609769141"/>
                     <pic:cNvPicPr/>
                   </pic:nvPicPr>
                   <pic:blipFill>
@@ -71,7 +71,7 @@
                   <pic:spPr>
                     <a:xfrm>
                       <a:off x="0" y="0"/>
-                      <a:ext cx="5486400" cy="4029710"/>
+                      <a:ext cx="5486400" cy="4145280"/>
                     </a:xfrm>
                     <a:prstGeom prst="rect">
                       <a:avLst/>
@@ -153,21 +153,7 @@
         <w:rPr>
           <w:lang w:val="fr-FR"/>
         </w:rPr>
-        <w:t>✅ Modèle choisi : Constellation (</w:t>
-      </w:r>
-      <w:proofErr w:type="spellStart"/>
-      <w:r>
-        <w:rPr>
-          <w:lang w:val="fr-FR"/>
-        </w:rPr>
-        <w:t>Schema</w:t>
-      </w:r>
-      <w:proofErr w:type="spellEnd"/>
-      <w:r>
-        <w:rPr>
-          <w:lang w:val="fr-FR"/>
-        </w:rPr>
-        <w:t xml:space="preserve"> en étoile multi-faits)</w:t>
+        <w:t>✅ Modèle choisi : Constellation (Schema en étoile multi-faits)</w:t>
       </w:r>
     </w:p>
     <w:p>
@@ -180,41 +166,19 @@
         <w:rPr>
           <w:lang w:val="fr-FR"/>
         </w:rPr>
-        <w:t>Nous avons structuré notre Data Warehouse en plusieurs tables de faits spécialisées, toutes liées à des dimensions communes (</w:t>
-      </w:r>
-      <w:proofErr w:type="spellStart"/>
-      <w:r>
-        <w:rPr>
-          <w:lang w:val="fr-FR"/>
-        </w:rPr>
-        <w:t>dim_joueur</w:t>
-      </w:r>
-      <w:proofErr w:type="spellEnd"/>
-      <w:r>
-        <w:rPr>
-          <w:lang w:val="fr-FR"/>
-        </w:rPr>
-        <w:t xml:space="preserve">, </w:t>
-      </w:r>
-      <w:proofErr w:type="spellStart"/>
-      <w:r>
-        <w:rPr>
-          <w:lang w:val="fr-FR"/>
-        </w:rPr>
-        <w:t>dim_time</w:t>
-      </w:r>
-      <w:proofErr w:type="spellEnd"/>
-      <w:r>
-        <w:rPr>
-          <w:lang w:val="fr-FR"/>
-        </w:rPr>
-        <w:t>, etc.). Ce choix permet de :</w:t>
+        <w:t>Nous avons structuré notre Data Warehouse en plusieurs tables de faits spécialisées, toutes liées à des dimensions communes (dim_joueur, dim_time, etc.). Ce choix permet de :</w:t>
       </w:r>
       <w:r>
         <w:rPr>
           <w:lang w:val="fr-FR"/>
         </w:rPr>
         <w:br/>
+      </w:r>
+      <w:r>
+        <w:rPr>
+          <w:lang w:val="fr-FR"/>
+        </w:rPr>
+        <w:lastRenderedPageBreak/>
         <w:t>- segmenter les analyses par domaine (matchs, santé, entraînement…),</w:t>
       </w:r>
       <w:r>
@@ -222,12 +186,6 @@
           <w:lang w:val="fr-FR"/>
         </w:rPr>
         <w:br/>
-      </w:r>
-      <w:r>
-        <w:rPr>
-          <w:lang w:val="fr-FR"/>
-        </w:rPr>
-        <w:lastRenderedPageBreak/>
         <w:t>- optimiser les performances dans Power BI,</w:t>
       </w:r>
       <w:r>
@@ -265,134 +223,41 @@
         <w:rPr>
           <w:lang w:val="fr-FR"/>
         </w:rPr>
-        <w:t xml:space="preserve">- </w:t>
-      </w:r>
-      <w:proofErr w:type="spellStart"/>
-      <w:r>
-        <w:rPr>
-          <w:lang w:val="fr-FR"/>
-        </w:rPr>
-        <w:t>dim_joueur</w:t>
-      </w:r>
-      <w:proofErr w:type="spellEnd"/>
-      <w:r>
-        <w:rPr>
-          <w:lang w:val="fr-FR"/>
-        </w:rPr>
-        <w:t xml:space="preserve"> : Informations personnelles et biométriques du joueur</w:t>
+        <w:t>- dim_joueur : Informations personnelles et biométriques du joueur</w:t>
       </w:r>
       <w:r>
         <w:rPr>
           <w:lang w:val="fr-FR"/>
         </w:rPr>
         <w:br/>
-        <w:t xml:space="preserve">- </w:t>
-      </w:r>
-      <w:proofErr w:type="spellStart"/>
-      <w:r>
-        <w:rPr>
-          <w:lang w:val="fr-FR"/>
-        </w:rPr>
-        <w:t>dim_time</w:t>
-      </w:r>
-      <w:proofErr w:type="spellEnd"/>
-      <w:r>
-        <w:rPr>
-          <w:lang w:val="fr-FR"/>
-        </w:rPr>
-        <w:t xml:space="preserve"> : Découpage temporel pour les analyses par date</w:t>
+        <w:t>- dim_time : Découpage temporel pour les analyses par date</w:t>
       </w:r>
       <w:r>
         <w:rPr>
           <w:lang w:val="fr-FR"/>
         </w:rPr>
         <w:br/>
-        <w:t xml:space="preserve">- </w:t>
-      </w:r>
-      <w:proofErr w:type="spellStart"/>
-      <w:r>
-        <w:rPr>
-          <w:lang w:val="fr-FR"/>
-        </w:rPr>
-        <w:t>dim_match</w:t>
-      </w:r>
-      <w:proofErr w:type="spellEnd"/>
-      <w:r>
-        <w:rPr>
-          <w:lang w:val="fr-FR"/>
-        </w:rPr>
-        <w:t xml:space="preserve"> : Données de contexte du match, liées à </w:t>
-      </w:r>
-      <w:proofErr w:type="spellStart"/>
-      <w:r>
-        <w:rPr>
-          <w:lang w:val="fr-FR"/>
-        </w:rPr>
-        <w:t>dim_contexte</w:t>
-      </w:r>
-      <w:proofErr w:type="spellEnd"/>
-      <w:r>
-        <w:rPr>
-          <w:lang w:val="fr-FR"/>
-        </w:rPr>
-        <w:br/>
-        <w:t xml:space="preserve">- </w:t>
-      </w:r>
-      <w:proofErr w:type="spellStart"/>
-      <w:r>
-        <w:rPr>
-          <w:lang w:val="fr-FR"/>
-        </w:rPr>
-        <w:t>dim_contexte</w:t>
-      </w:r>
-      <w:proofErr w:type="spellEnd"/>
-      <w:r>
-        <w:rPr>
-          <w:lang w:val="fr-FR"/>
-        </w:rPr>
-        <w:t xml:space="preserve"> : Détail des conditions du match (météo, adversaire...)</w:t>
+        <w:t>- dim_match : Données de contexte du match</w:t>
       </w:r>
       <w:r>
         <w:rPr>
           <w:lang w:val="fr-FR"/>
         </w:rPr>
-        <w:br/>
-        <w:t xml:space="preserve">- </w:t>
-      </w:r>
-      <w:proofErr w:type="spellStart"/>
-      <w:r>
-        <w:rPr>
-          <w:lang w:val="fr-FR"/>
-        </w:rPr>
-        <w:t>dim_entrainement</w:t>
-      </w:r>
-      <w:proofErr w:type="spellEnd"/>
-      <w:r>
-        <w:rPr>
-          <w:lang w:val="fr-FR"/>
-        </w:rPr>
-        <w:t xml:space="preserve"> : Catégorie et intensité de l'entraînement</w:t>
+        <w:t xml:space="preserve"> (on a intégré la table contextuelle dans cette dimension</w:t>
       </w:r>
       <w:r>
         <w:rPr>
           <w:lang w:val="fr-FR"/>
         </w:rPr>
         <w:br/>
-        <w:t xml:space="preserve">- </w:t>
+        <w:t>- dim_entrainement : Catégorie et intensité de l'entraînement</w:t>
       </w:r>
-      <w:proofErr w:type="spellStart"/>
       <w:r>
         <w:rPr>
           <w:lang w:val="fr-FR"/>
         </w:rPr>
-        <w:t>dim_objectif</w:t>
-      </w:r>
-      <w:proofErr w:type="spellEnd"/>
-      <w:r>
-        <w:rPr>
-          <w:lang w:val="fr-FR"/>
-        </w:rPr>
-        <w:t xml:space="preserve"> : Typologie des objectifs fixés</w:t>
+        <w:br/>
+        <w:t>- dim_objectif : Typologie des objectifs fixés</w:t>
       </w:r>
     </w:p>
     <w:p>
@@ -422,126 +287,42 @@
         <w:rPr>
           <w:lang w:val="fr-FR"/>
         </w:rPr>
-        <w:t xml:space="preserve">- </w:t>
-      </w:r>
-      <w:proofErr w:type="spellStart"/>
-      <w:r>
-        <w:rPr>
-          <w:lang w:val="fr-FR"/>
-        </w:rPr>
-        <w:t>faits_matchs</w:t>
-      </w:r>
-      <w:proofErr w:type="spellEnd"/>
-      <w:r>
-        <w:rPr>
-          <w:lang w:val="fr-FR"/>
-        </w:rPr>
-        <w:t xml:space="preserve"> : Événements de match par joueur (temps de jeu, buts, cartons...)</w:t>
+        <w:t>- faits_matchs : Événements de match par joueur (temps de jeu, buts, cartons...)</w:t>
       </w:r>
       <w:r>
         <w:rPr>
           <w:lang w:val="fr-FR"/>
         </w:rPr>
         <w:br/>
-        <w:t xml:space="preserve">- </w:t>
-      </w:r>
-      <w:proofErr w:type="spellStart"/>
-      <w:r>
-        <w:rPr>
-          <w:lang w:val="fr-FR"/>
-        </w:rPr>
-        <w:t>faits_performances</w:t>
-      </w:r>
-      <w:proofErr w:type="spellEnd"/>
-      <w:r>
-        <w:rPr>
-          <w:lang w:val="fr-FR"/>
-        </w:rPr>
-        <w:t xml:space="preserve"> : Données techniques, tactiques et physiques par match</w:t>
+        <w:t>- faits_performances : Données techniques, tactiques et physiques par match</w:t>
       </w:r>
       <w:r>
         <w:rPr>
           <w:lang w:val="fr-FR"/>
         </w:rPr>
         <w:br/>
-        <w:t xml:space="preserve">- </w:t>
-      </w:r>
-      <w:proofErr w:type="spellStart"/>
-      <w:r>
-        <w:rPr>
-          <w:lang w:val="fr-FR"/>
-        </w:rPr>
-        <w:t>faits_entrainements</w:t>
-      </w:r>
-      <w:proofErr w:type="spellEnd"/>
-      <w:r>
-        <w:rPr>
-          <w:lang w:val="fr-FR"/>
-        </w:rPr>
-        <w:t xml:space="preserve"> : Détail des séances par joueur (durée, intensité, distance...)</w:t>
+        <w:t>- faits_entrainements : Détail des séances par joueur (durée, intensité, distance...)</w:t>
       </w:r>
       <w:r>
         <w:rPr>
           <w:lang w:val="fr-FR"/>
         </w:rPr>
         <w:br/>
-        <w:t xml:space="preserve">- </w:t>
-      </w:r>
-      <w:proofErr w:type="spellStart"/>
-      <w:r>
-        <w:rPr>
-          <w:lang w:val="fr-FR"/>
-        </w:rPr>
-        <w:t>faits_psychologiques</w:t>
-      </w:r>
-      <w:proofErr w:type="spellEnd"/>
-      <w:r>
-        <w:rPr>
-          <w:lang w:val="fr-FR"/>
-        </w:rPr>
-        <w:t xml:space="preserve"> : Scores de confiance et résilience par joueur/match</w:t>
+        <w:t>- faits_psychologiques : Scores de confiance et résilience par joueur/match</w:t>
       </w:r>
       <w:r>
         <w:rPr>
           <w:lang w:val="fr-FR"/>
         </w:rPr>
         <w:br/>
-        <w:t xml:space="preserve">- </w:t>
-      </w:r>
-      <w:proofErr w:type="spellStart"/>
-      <w:r>
-        <w:rPr>
-          <w:lang w:val="fr-FR"/>
-        </w:rPr>
-        <w:t>faits_objectifs</w:t>
-      </w:r>
-      <w:proofErr w:type="spellEnd"/>
-      <w:r>
-        <w:rPr>
-          <w:lang w:val="fr-FR"/>
-        </w:rPr>
-        <w:t xml:space="preserve"> : Suivi des objectifs fixés et atteints pour chaque joueur</w:t>
+        <w:t>- faits_objectifs : Suivi des objectifs fixés et atteints pour chaque joueur</w:t>
       </w:r>
       <w:r>
         <w:rPr>
           <w:lang w:val="fr-FR"/>
         </w:rPr>
         <w:br/>
-        <w:t xml:space="preserve">- </w:t>
-      </w:r>
-      <w:proofErr w:type="spellStart"/>
-      <w:r>
-        <w:rPr>
-          <w:lang w:val="fr-FR"/>
-        </w:rPr>
-        <w:t>faits_examens</w:t>
-      </w:r>
-      <w:proofErr w:type="spellEnd"/>
-      <w:r>
-        <w:rPr>
-          <w:lang w:val="fr-FR"/>
-        </w:rPr>
-        <w:t>_* : Données médicales par spécialité (5 tables séparées)</w:t>
+        <w:t>- faits_examens_* : Données médicales par spécialité (5 tables séparées)</w:t>
       </w:r>
     </w:p>
     <w:p>
@@ -603,19 +384,11 @@
           <w:lang w:val="fr-FR"/>
         </w:rPr>
       </w:pPr>
-      <w:proofErr w:type="gramStart"/>
       <w:r>
         <w:rPr>
           <w:lang w:val="fr-FR"/>
         </w:rPr>
-        <w:t>les</w:t>
-      </w:r>
-      <w:proofErr w:type="gramEnd"/>
-      <w:r>
-        <w:rPr>
-          <w:lang w:val="fr-FR"/>
-        </w:rPr>
-        <w:t xml:space="preserve"> données sont </w:t>
+        <w:t xml:space="preserve">les données sont </w:t>
       </w:r>
       <w:r>
         <w:rPr>
@@ -642,19 +415,11 @@
           <w:lang w:val="fr-FR"/>
         </w:rPr>
       </w:pPr>
-      <w:proofErr w:type="gramStart"/>
       <w:r>
         <w:rPr>
           <w:lang w:val="fr-FR"/>
         </w:rPr>
-        <w:t>les</w:t>
-      </w:r>
-      <w:proofErr w:type="gramEnd"/>
-      <w:r>
-        <w:rPr>
-          <w:lang w:val="fr-FR"/>
-        </w:rPr>
-        <w:t xml:space="preserve"> granularités varient (examen vs match),</w:t>
+        <w:t>les granularités varient (examen vs match),</w:t>
       </w:r>
     </w:p>
     <w:p>
@@ -667,19 +432,11 @@
           <w:lang w:val="fr-FR"/>
         </w:rPr>
       </w:pPr>
-      <w:proofErr w:type="gramStart"/>
       <w:r>
         <w:rPr>
           <w:lang w:val="fr-FR"/>
         </w:rPr>
-        <w:t>cela</w:t>
-      </w:r>
-      <w:proofErr w:type="gramEnd"/>
-      <w:r>
-        <w:rPr>
-          <w:lang w:val="fr-FR"/>
-        </w:rPr>
-        <w:t xml:space="preserve"> réduirait la </w:t>
+        <w:t xml:space="preserve">cela réduirait la </w:t>
       </w:r>
       <w:r>
         <w:rPr>
@@ -714,7 +471,6 @@
         </w:rPr>
         <w:t xml:space="preserve"> </w:t>
       </w:r>
-      <w:proofErr w:type="gramStart"/>
       <w:r>
         <w:rPr>
           <w:b/>
@@ -727,14 +483,7 @@
         <w:rPr>
           <w:lang w:val="fr-FR"/>
         </w:rPr>
-        <w:t xml:space="preserve"> :</w:t>
-      </w:r>
-      <w:proofErr w:type="gramEnd"/>
-      <w:r>
-        <w:rPr>
-          <w:lang w:val="fr-FR"/>
-        </w:rPr>
-        <w:t xml:space="preserve"> Les </w:t>
+        <w:t xml:space="preserve"> : Les </w:t>
       </w:r>
       <w:r>
         <w:rPr>
@@ -810,6 +559,12 @@
           <w:lang w:val="fr-FR"/>
         </w:rPr>
         <w:br/>
+      </w:r>
+      <w:r>
+        <w:rPr>
+          <w:lang w:val="fr-FR"/>
+        </w:rPr>
+        <w:lastRenderedPageBreak/>
         <w:t>- la possibilité de filtrer ou agréger par spécialité médicale</w:t>
       </w:r>
       <w:r>
@@ -831,7 +586,6 @@
         <w:rPr>
           <w:lang w:val="fr-FR"/>
         </w:rPr>
-        <w:lastRenderedPageBreak/>
         <w:t>Ajout de colonnes booléennes dans les tables de faits</w:t>
       </w:r>
       <w:r>
@@ -892,36 +646,16 @@
       <w:r>
         <w:t xml:space="preserve"> </w:t>
       </w:r>
-      <w:proofErr w:type="spellStart"/>
       <w:r>
         <w:rPr>
           <w:b/>
           <w:bCs/>
         </w:rPr>
-        <w:t>Exemples</w:t>
+        <w:t>Exemples valides</w:t>
       </w:r>
-      <w:proofErr w:type="spellEnd"/>
-      <w:r>
-        <w:rPr>
-          <w:b/>
-          <w:bCs/>
-        </w:rPr>
-        <w:t xml:space="preserve"> </w:t>
-      </w:r>
-      <w:proofErr w:type="spellStart"/>
-      <w:proofErr w:type="gramStart"/>
-      <w:r>
-        <w:rPr>
-          <w:b/>
-          <w:bCs/>
-        </w:rPr>
-        <w:t>valides</w:t>
-      </w:r>
-      <w:proofErr w:type="spellEnd"/>
       <w:r>
         <w:t xml:space="preserve"> :</w:t>
       </w:r>
-      <w:proofErr w:type="gramEnd"/>
     </w:p>
     <w:p>
       <w:pPr>
@@ -937,21 +671,7 @@
         <w:rPr>
           <w:lang w:val="fr-FR"/>
         </w:rPr>
-        <w:t xml:space="preserve">Titulaire dans </w:t>
-      </w:r>
-      <w:proofErr w:type="spellStart"/>
-      <w:r>
-        <w:rPr>
-          <w:lang w:val="fr-FR"/>
-        </w:rPr>
-        <w:t>faits_matchs</w:t>
-      </w:r>
-      <w:proofErr w:type="spellEnd"/>
-      <w:r>
-        <w:rPr>
-          <w:lang w:val="fr-FR"/>
-        </w:rPr>
-        <w:t xml:space="preserve"> = le joueur a-t-il été aligné au départ du match ?</w:t>
+        <w:t>Titulaire dans faits_matchs = le joueur a-t-il été aligné au départ du match ?</w:t>
       </w:r>
     </w:p>
     <w:p>
@@ -968,21 +688,7 @@
         <w:rPr>
           <w:lang w:val="fr-FR"/>
         </w:rPr>
-        <w:t xml:space="preserve">Asthme, Diabète_Type_1 dans </w:t>
-      </w:r>
-      <w:proofErr w:type="spellStart"/>
-      <w:r>
-        <w:rPr>
-          <w:lang w:val="fr-FR"/>
-        </w:rPr>
-        <w:t>faits_examens_generaux</w:t>
-      </w:r>
-      <w:proofErr w:type="spellEnd"/>
-      <w:r>
-        <w:rPr>
-          <w:lang w:val="fr-FR"/>
-        </w:rPr>
-        <w:t xml:space="preserve"> = détection médicale à la date de l’examen</w:t>
+        <w:t>Asthme, Diabète_Type_1 dans faits_examens_generaux = détection médicale à la date de l’examen</w:t>
       </w:r>
     </w:p>
     <w:p>
@@ -1003,7 +709,6 @@
         </w:rPr>
         <w:t xml:space="preserve"> </w:t>
       </w:r>
-      <w:proofErr w:type="gramStart"/>
       <w:r>
         <w:rPr>
           <w:b/>
@@ -1016,23 +721,8 @@
         <w:rPr>
           <w:lang w:val="fr-FR"/>
         </w:rPr>
-        <w:t xml:space="preserve"> :</w:t>
+        <w:t xml:space="preserve"> : Ces valeurs sont justifiées car elles participent à des calculs analytiques comme :</w:t>
       </w:r>
-      <w:proofErr w:type="gramEnd"/>
-      <w:r>
-        <w:rPr>
-          <w:lang w:val="fr-FR"/>
-        </w:rPr>
-        <w:t xml:space="preserve"> Ces valeurs sont justifiées car elles participent à des calculs analytiques </w:t>
-      </w:r>
-      <w:proofErr w:type="gramStart"/>
-      <w:r>
-        <w:rPr>
-          <w:lang w:val="fr-FR"/>
-        </w:rPr>
-        <w:t>comme :</w:t>
-      </w:r>
-      <w:proofErr w:type="gramEnd"/>
     </w:p>
     <w:p>
       <w:pPr>
@@ -1041,13 +731,8 @@
           <w:numId w:val="11"/>
         </w:numPr>
       </w:pPr>
-      <w:proofErr w:type="spellStart"/>
       <w:r>
-        <w:t>détection</w:t>
-      </w:r>
-      <w:proofErr w:type="spellEnd"/>
-      <w:r>
-        <w:t xml:space="preserve"> de pathologies chroniques,</w:t>
+        <w:t>détection de pathologies chroniques,</w:t>
       </w:r>
     </w:p>
     <w:p>
@@ -1057,21 +742,8 @@
           <w:numId w:val="11"/>
         </w:numPr>
       </w:pPr>
-      <w:proofErr w:type="spellStart"/>
       <w:r>
-        <w:t>alertes</w:t>
-      </w:r>
-      <w:proofErr w:type="spellEnd"/>
-      <w:r>
-        <w:t xml:space="preserve"> </w:t>
-      </w:r>
-      <w:proofErr w:type="spellStart"/>
-      <w:r>
-        <w:t>médicales</w:t>
-      </w:r>
-      <w:proofErr w:type="spellEnd"/>
-      <w:r>
-        <w:t>,</w:t>
+        <w:t>alertes médicales,</w:t>
       </w:r>
     </w:p>
     <w:p>
@@ -1084,19 +756,11 @@
           <w:lang w:val="fr-FR"/>
         </w:rPr>
       </w:pPr>
-      <w:proofErr w:type="gramStart"/>
       <w:r>
         <w:rPr>
           <w:lang w:val="fr-FR"/>
         </w:rPr>
-        <w:t>filtrage</w:t>
-      </w:r>
-      <w:proofErr w:type="gramEnd"/>
-      <w:r>
-        <w:rPr>
-          <w:lang w:val="fr-FR"/>
-        </w:rPr>
-        <w:t xml:space="preserve"> conditionnel dans Power BI.</w:t>
+        <w:t>filtrage conditionnel dans Power BI.</w:t>
       </w:r>
     </w:p>
     <w:p>
@@ -1117,21 +781,7 @@
         <w:rPr>
           <w:lang w:val="fr-FR"/>
         </w:rPr>
-        <w:t xml:space="preserve">Création d’une seule table de faits </w:t>
-      </w:r>
-      <w:proofErr w:type="spellStart"/>
-      <w:r>
-        <w:rPr>
-          <w:lang w:val="fr-FR"/>
-        </w:rPr>
-        <w:t>faits_performances</w:t>
-      </w:r>
-      <w:proofErr w:type="spellEnd"/>
-      <w:r>
-        <w:rPr>
-          <w:lang w:val="fr-FR"/>
-        </w:rPr>
-        <w:t xml:space="preserve"> pour les données techniques, tactiques et athlétiques</w:t>
+        <w:t>Création d’une seule table de faits faits_performances pour les données techniques, tactiques et athlétiques</w:t>
       </w:r>
       <w:r>
         <w:rPr>
@@ -1150,35 +800,7 @@
         <w:rPr>
           <w:lang w:val="fr-FR"/>
         </w:rPr>
-        <w:t xml:space="preserve">Nous avons fait le choix de fusionner les anciennes tables techniques, tactiques et athlétiques dans </w:t>
-      </w:r>
-      <w:proofErr w:type="gramStart"/>
-      <w:r>
-        <w:rPr>
-          <w:lang w:val="fr-FR"/>
-        </w:rPr>
-        <w:t xml:space="preserve">une seule table </w:t>
-      </w:r>
-      <w:proofErr w:type="spellStart"/>
-      <w:r>
-        <w:rPr>
-          <w:lang w:val="fr-FR"/>
-        </w:rPr>
-        <w:t>faits</w:t>
-      </w:r>
-      <w:proofErr w:type="gramEnd"/>
-      <w:r>
-        <w:rPr>
-          <w:lang w:val="fr-FR"/>
-        </w:rPr>
-        <w:t>_performances</w:t>
-      </w:r>
-      <w:proofErr w:type="spellEnd"/>
-      <w:r>
-        <w:rPr>
-          <w:lang w:val="fr-FR"/>
-        </w:rPr>
-        <w:t xml:space="preserve"> car :</w:t>
+        <w:t>Nous avons fait le choix de fusionner les anciennes tables techniques, tactiques et athlétiques dans une seule table faits_performances car :</w:t>
       </w:r>
     </w:p>
     <w:p>
@@ -1240,21 +862,7 @@
         <w:rPr>
           <w:lang w:val="fr-FR"/>
         </w:rPr>
-        <w:t xml:space="preserve"> dans les </w:t>
-      </w:r>
-      <w:proofErr w:type="spellStart"/>
-      <w:r>
-        <w:rPr>
-          <w:lang w:val="fr-FR"/>
-        </w:rPr>
-        <w:t>dashboards</w:t>
-      </w:r>
-      <w:proofErr w:type="spellEnd"/>
-      <w:r>
-        <w:rPr>
-          <w:lang w:val="fr-FR"/>
-        </w:rPr>
-        <w:t xml:space="preserve"> (ex : pour mesurer la performance globale sur un match).</w:t>
+        <w:t xml:space="preserve"> dans les dashboards (ex : pour mesurer la performance globale sur un match).</w:t>
       </w:r>
     </w:p>
     <w:p>
@@ -1298,8 +906,6 @@
       <w:r>
         <w:t xml:space="preserve"> </w:t>
       </w:r>
-      <w:proofErr w:type="spellStart"/>
-      <w:proofErr w:type="gramStart"/>
       <w:r>
         <w:rPr>
           <w:b/>
@@ -1307,11 +913,9 @@
         </w:rPr>
         <w:t>Avantages</w:t>
       </w:r>
-      <w:proofErr w:type="spellEnd"/>
       <w:r>
         <w:t xml:space="preserve"> :</w:t>
       </w:r>
-      <w:proofErr w:type="gramEnd"/>
     </w:p>
     <w:p>
       <w:pPr>
@@ -1382,7 +986,6 @@
         </w:rPr>
         <w:t xml:space="preserve"> </w:t>
       </w:r>
-      <w:proofErr w:type="gramStart"/>
       <w:r>
         <w:rPr>
           <w:b/>
@@ -1395,14 +998,7 @@
         <w:rPr>
           <w:lang w:val="fr-FR"/>
         </w:rPr>
-        <w:t xml:space="preserve"> :</w:t>
-      </w:r>
-      <w:proofErr w:type="gramEnd"/>
-      <w:r>
-        <w:rPr>
-          <w:lang w:val="fr-FR"/>
-        </w:rPr>
-        <w:t xml:space="preserve"> Le regroupement permet un modèle plus fluide tout en conservant la clarté analytique.</w:t>
+        <w:t xml:space="preserve"> : Le regroupement permet un modèle plus fluide tout en conservant la clarté analytique.</w:t>
       </w:r>
     </w:p>
     <w:p>
@@ -1423,22 +1019,7 @@
         <w:rPr>
           <w:lang w:val="fr-FR"/>
         </w:rPr>
-        <w:lastRenderedPageBreak/>
-        <w:t xml:space="preserve">Maintien de </w:t>
-      </w:r>
-      <w:proofErr w:type="spellStart"/>
-      <w:r>
-        <w:rPr>
-          <w:lang w:val="fr-FR"/>
-        </w:rPr>
-        <w:t>dim_time</w:t>
-      </w:r>
-      <w:proofErr w:type="spellEnd"/>
-      <w:r>
-        <w:rPr>
-          <w:lang w:val="fr-FR"/>
-        </w:rPr>
-        <w:t xml:space="preserve"> comme dimension temporelle centrale</w:t>
+        <w:t>Maintien de dim_time comme dimension temporelle centrale</w:t>
       </w:r>
       <w:r>
         <w:rPr>
@@ -1457,21 +1038,7 @@
         <w:rPr>
           <w:lang w:val="fr-FR"/>
         </w:rPr>
-        <w:t xml:space="preserve">L’utilisation d’une dimension </w:t>
-      </w:r>
-      <w:proofErr w:type="spellStart"/>
-      <w:r>
-        <w:rPr>
-          <w:lang w:val="fr-FR"/>
-        </w:rPr>
-        <w:t>dim_time</w:t>
-      </w:r>
-      <w:proofErr w:type="spellEnd"/>
-      <w:r>
-        <w:rPr>
-          <w:lang w:val="fr-FR"/>
-        </w:rPr>
-        <w:t xml:space="preserve"> permet de :</w:t>
+        <w:t>L’utilisation d’une dimension dim_time permet de :</w:t>
       </w:r>
     </w:p>
     <w:p>
@@ -1484,19 +1051,11 @@
           <w:lang w:val="fr-FR"/>
         </w:rPr>
       </w:pPr>
-      <w:proofErr w:type="gramStart"/>
       <w:r>
         <w:rPr>
           <w:lang w:val="fr-FR"/>
         </w:rPr>
-        <w:t>faciliter</w:t>
-      </w:r>
-      <w:proofErr w:type="gramEnd"/>
-      <w:r>
-        <w:rPr>
-          <w:lang w:val="fr-FR"/>
-        </w:rPr>
-        <w:t xml:space="preserve"> les </w:t>
+        <w:t xml:space="preserve">faciliter les </w:t>
       </w:r>
       <w:r>
         <w:rPr>
@@ -1523,19 +1082,11 @@
           <w:lang w:val="fr-FR"/>
         </w:rPr>
       </w:pPr>
-      <w:proofErr w:type="gramStart"/>
       <w:r>
         <w:rPr>
           <w:lang w:val="fr-FR"/>
         </w:rPr>
-        <w:t>créer</w:t>
-      </w:r>
-      <w:proofErr w:type="gramEnd"/>
-      <w:r>
-        <w:rPr>
-          <w:lang w:val="fr-FR"/>
-        </w:rPr>
-        <w:t xml:space="preserve"> des </w:t>
+        <w:t xml:space="preserve">créer des </w:t>
       </w:r>
       <w:r>
         <w:rPr>
@@ -1562,19 +1113,11 @@
           <w:lang w:val="fr-FR"/>
         </w:rPr>
       </w:pPr>
-      <w:proofErr w:type="gramStart"/>
       <w:r>
         <w:rPr>
           <w:lang w:val="fr-FR"/>
         </w:rPr>
-        <w:t>aligner</w:t>
-      </w:r>
-      <w:proofErr w:type="gramEnd"/>
-      <w:r>
-        <w:rPr>
-          <w:lang w:val="fr-FR"/>
-        </w:rPr>
-        <w:t xml:space="preserve"> les périodes entre différentes tables de faits,</w:t>
+        <w:t>aligner les périodes entre différentes tables de faits,</w:t>
       </w:r>
     </w:p>
     <w:p>
@@ -1587,33 +1130,11 @@
           <w:lang w:val="fr-FR"/>
         </w:rPr>
       </w:pPr>
-      <w:proofErr w:type="gramStart"/>
       <w:r>
         <w:rPr>
           <w:lang w:val="fr-FR"/>
         </w:rPr>
-        <w:t>standardiser</w:t>
-      </w:r>
-      <w:proofErr w:type="gramEnd"/>
-      <w:r>
-        <w:rPr>
-          <w:lang w:val="fr-FR"/>
-        </w:rPr>
-        <w:t xml:space="preserve"> l’axe temporel (ex : même </w:t>
-      </w:r>
-      <w:proofErr w:type="spellStart"/>
-      <w:r>
-        <w:rPr>
-          <w:lang w:val="fr-FR"/>
-        </w:rPr>
-        <w:t>ID_Temps</w:t>
-      </w:r>
-      <w:proofErr w:type="spellEnd"/>
-      <w:r>
-        <w:rPr>
-          <w:lang w:val="fr-FR"/>
-        </w:rPr>
-        <w:t xml:space="preserve"> pour match et examen du même jour).</w:t>
+        <w:t>standardiser l’axe temporel (ex : même ID_Temps pour match et examen du même jour).</w:t>
       </w:r>
     </w:p>
     <w:p>
@@ -1634,7 +1155,6 @@
         </w:rPr>
         <w:t xml:space="preserve"> </w:t>
       </w:r>
-      <w:proofErr w:type="gramStart"/>
       <w:r>
         <w:rPr>
           <w:b/>
@@ -1647,14 +1167,7 @@
         <w:rPr>
           <w:lang w:val="fr-FR"/>
         </w:rPr>
-        <w:t xml:space="preserve"> :</w:t>
-      </w:r>
-      <w:proofErr w:type="gramEnd"/>
-      <w:r>
-        <w:rPr>
-          <w:lang w:val="fr-FR"/>
-        </w:rPr>
-        <w:t xml:space="preserve"> C’est une </w:t>
+        <w:t xml:space="preserve"> : C’est une </w:t>
       </w:r>
       <w:r>
         <w:rPr>
@@ -1680,89 +1193,6 @@
     </w:p>
     <w:p>
       <w:pPr>
-        <w:pStyle w:val="Heading2"/>
-        <w:rPr>
-          <w:lang w:val="fr-FR"/>
-        </w:rPr>
-      </w:pPr>
-      <w:r>
-        <w:rPr>
-          <w:lang w:val="fr-FR"/>
-        </w:rPr>
-        <w:t>Ne pas fusionner match + contexte :</w:t>
-      </w:r>
-    </w:p>
-    <w:p>
-      <w:pPr>
-        <w:rPr>
-          <w:lang w:val="fr-FR"/>
-        </w:rPr>
-      </w:pPr>
-      <w:r>
-        <w:rPr>
-          <w:lang w:val="fr-FR"/>
-        </w:rPr>
-        <w:t xml:space="preserve">Bien que chaque match ait un contexte unique, nous avons préservé la séparation entre </w:t>
-      </w:r>
-      <w:proofErr w:type="spellStart"/>
-      <w:r>
-        <w:rPr>
-          <w:lang w:val="fr-FR"/>
-        </w:rPr>
-        <w:t>dim_match</w:t>
-      </w:r>
-      <w:proofErr w:type="spellEnd"/>
-      <w:r>
-        <w:rPr>
-          <w:lang w:val="fr-FR"/>
-        </w:rPr>
-        <w:t xml:space="preserve"> et </w:t>
-      </w:r>
-      <w:proofErr w:type="spellStart"/>
-      <w:r>
-        <w:rPr>
-          <w:lang w:val="fr-FR"/>
-        </w:rPr>
-        <w:t>dim_contexte</w:t>
-      </w:r>
-      <w:proofErr w:type="spellEnd"/>
-      <w:r>
-        <w:rPr>
-          <w:lang w:val="fr-FR"/>
-        </w:rPr>
-        <w:t xml:space="preserve"> pour :</w:t>
-      </w:r>
-      <w:r>
-        <w:rPr>
-          <w:lang w:val="fr-FR"/>
-        </w:rPr>
-        <w:br/>
-        <w:t>- conserver la modularité de la modélisation</w:t>
-      </w:r>
-      <w:r>
-        <w:rPr>
-          <w:lang w:val="fr-FR"/>
-        </w:rPr>
-        <w:br/>
-        <w:t>- permettre des analyses transverses sur les conditions (ex : performance selon météo)</w:t>
-      </w:r>
-      <w:r>
-        <w:rPr>
-          <w:lang w:val="fr-FR"/>
-        </w:rPr>
-        <w:br/>
-        <w:t>- respecter les bonnes pratiques de modélisation constellation</w:t>
-      </w:r>
-      <w:r>
-        <w:rPr>
-          <w:lang w:val="fr-FR"/>
-        </w:rPr>
-        <w:br/>
-        <w:t>- maintenir une évolutivité : d’autres faits peuvent réutiliser le contexte sans dépendre du match</w:t>
-      </w:r>
-    </w:p>
-    <w:p>
-      <w:pPr>
         <w:pStyle w:val="Heading1"/>
         <w:rPr>
           <w:lang w:val="fr-FR"/>
@@ -1809,21 +1239,7 @@
           <w:lang w:val="fr-FR"/>
         </w:rPr>
         <w:br/>
-        <w:t xml:space="preserve">- générer des </w:t>
-      </w:r>
-      <w:proofErr w:type="spellStart"/>
-      <w:r>
-        <w:rPr>
-          <w:lang w:val="fr-FR"/>
-        </w:rPr>
-        <w:t>dashboards</w:t>
-      </w:r>
-      <w:proofErr w:type="spellEnd"/>
-      <w:r>
-        <w:rPr>
-          <w:lang w:val="fr-FR"/>
-        </w:rPr>
-        <w:t xml:space="preserve"> Power BI clairs, segmentés par expertise</w:t>
+        <w:t>- générer des dashboards Power BI clairs, segmentés par expertise</w:t>
       </w:r>
       <w:r>
         <w:rPr>
@@ -3568,6 +2984,7 @@
   <w:style w:type="character" w:default="1" w:styleId="DefaultParagraphFont">
     <w:name w:val="Default Paragraph Font"/>
     <w:uiPriority w:val="1"/>
+    <w:semiHidden/>
     <w:unhideWhenUsed/>
   </w:style>
   <w:style w:type="table" w:default="1" w:styleId="TableNormal">

</xml_diff>